<commit_message>
Remove campo naturalidade_resp1 dos templates de imagem e voz
</commit_message>
<xml_diff>
--- a/templates_contratos/IMAGEM-E-VOZ-ALUNO-INSTITUCIONAL_1.docx
+++ b/templates_contratos/IMAGEM-E-VOZ-ALUNO-INSTITUCIONAL_1.docx
@@ -146,21 +146,6 @@
           <w:szCs w:val="22"/>
         </w:rPr>
         <w:t>{{responsavel1}}</w:t>
-      </w:r>
-      <w:r>
-        <w:rPr>
-          <w:sz w:val="22"/>
-          <w:szCs w:val="22"/>
-        </w:rPr>
-        <w:t xml:space="preserve">, </w:t>
-      </w:r>
-      <w:r>
-        <w:rPr>
-          <w:b/>
-          <w:sz w:val="22"/>
-          <w:szCs w:val="22"/>
-        </w:rPr>
-        <w:t>{{naturalidade_resp1}}</w:t>
       </w:r>
       <w:r>
         <w:rPr>

</xml_diff>

<commit_message>
fix: adiciona nasc_resp1 ao contexto do termo de imagem
</commit_message>
<xml_diff>
--- a/templates_contratos/IMAGEM-E-VOZ-ALUNO-INSTITUCIONAL_1.docx
+++ b/templates_contratos/IMAGEM-E-VOZ-ALUNO-INSTITUCIONAL_1.docx
@@ -205,29 +205,46 @@
           <w:sz w:val="22"/>
           <w:szCs w:val="22"/>
         </w:rPr>
-        <w:t>{{nome_aluno}}</w:t>
-      </w:r>
-      <w:r>
-        <w:rPr>
-          <w:sz w:val="22"/>
-          <w:szCs w:val="22"/>
-        </w:rPr>
-        <w:t xml:space="preserve">, </w:t>
-      </w:r>
-      <w:r>
-        <w:rPr>
-          <w:b/>
-          <w:sz w:val="22"/>
-          <w:szCs w:val="22"/>
-        </w:rPr>
-        <w:t>{{naturalidade_aluno}}</w:t>
-      </w:r>
-      <w:r>
-        <w:rPr>
-          <w:sz w:val="22"/>
-          <w:szCs w:val="22"/>
-        </w:rPr>
-        <w:t xml:space="preserve">, nascido(a) em </w:t>
+        <w:t>{{</w:t>
+      </w:r>
+      <w:proofErr w:type="spellStart"/>
+      <w:r>
+        <w:rPr>
+          <w:b/>
+          <w:sz w:val="22"/>
+          <w:szCs w:val="22"/>
+        </w:rPr>
+        <w:t>nome_aluno</w:t>
+      </w:r>
+      <w:proofErr w:type="spellEnd"/>
+      <w:r>
+        <w:rPr>
+          <w:b/>
+          <w:sz w:val="22"/>
+          <w:szCs w:val="22"/>
+        </w:rPr>
+        <w:t>}}</w:t>
+      </w:r>
+      <w:r>
+        <w:rPr>
+          <w:sz w:val="22"/>
+          <w:szCs w:val="22"/>
+        </w:rPr>
+        <w:t>,</w:t>
+      </w:r>
+      <w:r>
+        <w:rPr>
+          <w:sz w:val="22"/>
+          <w:szCs w:val="22"/>
+        </w:rPr>
+        <w:t xml:space="preserve"> </w:t>
+      </w:r>
+      <w:r>
+        <w:rPr>
+          <w:sz w:val="22"/>
+          <w:szCs w:val="22"/>
+        </w:rPr>
+        <w:t xml:space="preserve">nascido(a) em </w:t>
       </w:r>
       <w:r>
         <w:rPr>

</xml_diff>